<commit_message>
added medical logic and removed AI
</commit_message>
<xml_diff>
--- a/files/Medical_Draft.docx
+++ b/files/Medical_Draft.docx
@@ -1732,7 +1732,16 @@
           <w:sz w:val="23"/>
           <w:szCs w:val="23"/>
         </w:rPr>
-        <w:t xml:space="preserve">  for in</w:t>
+        <w:t xml:space="preserve"> </w:t>
+      </w:r>
+      <w:r>
+        <w:rPr>
+          <w:rFonts w:ascii="Segoe UI" w:hAnsi="Segoe UI" w:cs="Segoe UI"/>
+          <w:bCs/>
+          <w:sz w:val="23"/>
+          <w:szCs w:val="23"/>
+        </w:rPr>
+        <w:t>for in</w:t>
       </w:r>
       <w:r>
         <w:rPr>

</xml_diff>